<commit_message>
Added Solid Principles Document
</commit_message>
<xml_diff>
--- a/JAVA Interview Docs/springboot/springboot.docx
+++ b/JAVA Interview Docs/springboot/springboot.docx
@@ -80,7 +80,6 @@
     </w:p>
     <w:p>
       <w:pPr>
-        <w:pStyle w:val="ListParagraph"/>
         <w:spacing w:after="0" w:line="240" w:lineRule="auto"/>
         <w:rPr>
           <w:rFonts w:ascii="Segoe UI" w:eastAsia="Times New Roman" w:hAnsi="Segoe UI" w:cs="Segoe UI"/>
@@ -92,8 +91,7 @@
     </w:p>
     <w:p>
       <w:pPr>
-        <w:shd w:val="clear" w:color="auto" w:fill="FFFFFF"/>
-        <w:spacing w:before="480" w:after="0" w:line="480" w:lineRule="atLeast"/>
+        <w:spacing w:after="0" w:line="240" w:lineRule="auto"/>
         <w:rPr>
           <w:rFonts w:ascii="Segoe UI" w:eastAsia="Times New Roman" w:hAnsi="Segoe UI" w:cs="Segoe UI"/>
           <w:sz w:val="21"/>
@@ -669,17 +667,7 @@
           <w:szCs w:val="23"/>
           <w:shd w:val="clear" w:color="auto" w:fill="FFFFFF"/>
         </w:rPr>
-        <w:t>T</w:t>
-      </w:r>
-      <w:r>
-        <w:rPr>
-          <w:rFonts w:ascii="Arial" w:hAnsi="Arial" w:cs="Arial"/>
-          <w:color w:val="242729"/>
-          <w:sz w:val="23"/>
-          <w:szCs w:val="23"/>
-          <w:shd w:val="clear" w:color="auto" w:fill="FFFFFF"/>
-        </w:rPr>
-        <w:t>he </w:t>
+        <w:t>The </w:t>
       </w:r>
       <w:r>
         <w:rPr>
@@ -846,7 +834,6 @@
           <w:sz w:val="21"/>
           <w:szCs w:val="21"/>
         </w:rPr>
-        <w:lastRenderedPageBreak/>
         <w:t xml:space="preserve">Create the datasource,entitymaanager and transaction manager using the datasource property details using </w:t>
       </w:r>
       <w:r>
@@ -896,6 +883,7 @@
           <w:sz w:val="21"/>
           <w:szCs w:val="21"/>
         </w:rPr>
+        <w:lastRenderedPageBreak/>
         <w:t xml:space="preserve">Make at least one data source as primary. </w:t>
       </w:r>
       <w:r>

</xml_diff>